<commit_message>
Update Research Navigator blueprint with value prop and pain point framing (TES-19)
- Lead "What Is It" section with NIH/NSF reviewer pain point
- Reframe tool value prop around grant proposal strength
- Update central-shift line to outcome-first language
- Regenerate PlastiLex_Blueprint_ResearchNavigator.docx

Co-Authored-By: Paperclip <noreply@paperclip.ing>
</commit_message>
<xml_diff>
--- a/mockup/PlastiLex_Blueprint_ResearchNavigator.docx
+++ b/mockup/PlastiLex_Blueprint_ResearchNavigator.docx
@@ -87,12 +87,12 @@
     </w:p>
     <w:p>
       <w:r>
-        <w:t>Every year, thousands of Chinese-language microplastics studies are published in databases that English-speaking scientists cannot read, navigate, or cite. The knowledge exists. The barrier is access -- and access is not just about language. It is about knowing the work exists at all, knowing who is doing it, and knowing how to reach them.</w:t>
+        <w:t>NIH and NSF reviewers increasingly flag grant proposals that miss substantial international literature. In microplastics research, that means Chinese-language studies -- thousands of them published every year in databases that English-speaking scientists cannot read, navigate, or cite. The work exists. Most researchers do not know it does.</w:t>
       </w:r>
     </w:p>
     <w:p>
       <w:r>
-        <w:t>PlastiLex Research Navigator is a web application that breaks all three barriers at once. It gives any researcher a semantically searchable index of Chinese microplastics literature, an AI chat interface that answers questions about that literature, a collaborator discovery engine that surfaces the Chinese scientists most relevant to their work -- and a Discover mode that shows researchers the research gaps they did not know existed.</w:t>
+        <w:t>PlastiLex Research Navigator is a web application built to close that gap. It gives any researcher a semantically searchable index of Chinese microplastics literature, an AI chat interface that answers questions about that literature, a collaborator discovery engine that surfaces the Chinese scientists most relevant to their work -- and a Discover mode that surfaces research gaps they did not know existed. The result: a stronger, more credible literature review and a grant proposal that reviewers cannot flag for missing international coverage.</w:t>
       </w:r>
     </w:p>
     <w:p>
@@ -104,12 +104,12 @@
       <w:r>
         <w:t>From: "Here are the gaps in Chinese-English microplastics research coverage."</w:t>
         <w:br/>
-        <w:t>To: "Help me find the Chinese researchers solving the gap I care about -- and introduce me to them."</w:t>
+        <w:t>To: "Here are the research areas where Chinese literature can strengthen your next grant proposal -- and the researchers you should know."</w:t>
       </w:r>
     </w:p>
     <w:p>
       <w:r>
-        <w:t>The gap analysis data is not the product. It is the fuel that makes the product useful. A researcher arrives -- with or without a specific topic -- and leaves with: (a) a map of relevant Chinese research they did not know existed, (b) a shortlist of Chinese scientists working in that space, and (c) the tools to reach out.</w:t>
+        <w:t>The gap analysis data is not the product. It is the fuel that makes the product useful. A researcher arrives -- with or without a specific topic -- and leaves with: (a) a map of relevant Chinese research they did not know existed, (b) a shortlist of Chinese scientists working in that space, and (c) the tools to reach out and cite.</w:t>
       </w:r>
     </w:p>
     <w:p>

</xml_diff>